<commit_message>
Dataset v3: corrige la selección de variables y amplía el universo
- Universo con 3+ meses de historia (antes 12): con 12 quedaban afuera el
  40% de las filas, el 45% de los positivos y todos los productos nuevos.
  Nueva variable historia_corta.
- Fuera precio, costo y margen del catálogo y sus derivados (capital,
  venta en pesos, descuento implícito): el catálogo guarda solo el valor
  actual, así que aplicado a meses pasados es anacrónico. Queda el precio
  relativo a la subcategoría.
- Fuera el stock en tránsito (H6): sin definición y sin señal en 2026.
- Resultado: 201.306 filas x 60 features, 3,40% de positivos.
- Candidatos a target recalculados con el mismo universo: la inercia ya no
  distingue a los candidatos; la elección se justifica por negocio.
- Chequeo de señal reproducible (Modelo/chequeo_senal.py).
- Parte B, dashboard, presentación (HTML y PDF) y .md actualizados.

Co-Authored-By: Claude Opus 5.5 <noreply@anthropic.com>
</commit_message>
<xml_diff>
--- a/Entregable/Entregable 2/Entregable 2 - Parte B - COMPLETADO.docx
+++ b/Entregable/Entregable 2/Entregable 2 - Parte B - COMPLETADO.docx
@@ -10374,7 +10374,7 @@
                 <w:sz w:val="15"/>
                 <w:szCs w:val="15"/>
               </w:rPr>
-              <w:t xml:space="preserve">2,67% · 3.509 positivos</w:t>
+              <w:t xml:space="preserve">2,61% · 5.260 positivos</w:t>
             </w:r>
           </w:p>
         </w:tc>
@@ -10399,7 +10399,7 @@
                 <w:sz w:val="15"/>
                 <w:szCs w:val="15"/>
               </w:rPr>
-              <w:t xml:space="preserve">3,38% · 4.428 positivos</w:t>
+              <w:t xml:space="preserve">3,40% · 6.853 positivos</w:t>
             </w:r>
           </w:p>
         </w:tc>
@@ -10424,7 +10424,7 @@
                 <w:sz w:val="15"/>
                 <w:szCs w:val="15"/>
               </w:rPr>
-              <w:t xml:space="preserve">+26%. Es el cambio más relevante para el modelo: el tratamiento de las devoluciones (P23) redefine qué posiciones son positivas, sobre todo las de muy bajo volumen.</w:t>
+              <w:t xml:space="preserve">+30%. Es el cambio más relevante para el modelo: el tratamiento de las devoluciones (P23) redefine qué posiciones son positivas, sobre todo las de muy bajo volumen.</w:t>
             </w:r>
           </w:p>
         </w:tc>
@@ -10449,7 +10449,7 @@
           <w:sz w:val="21"/>
           <w:szCs w:val="21"/>
         </w:rPr>
-        <w:t xml:space="preserve">Los problemas de calidad mueven poco los agregados (menos de 2% en venta, unidades y capital), pero sí los cortes que usa el modelo: por SKU (duplicados y costos faltantes), por categoría (Decoración) y por posición. La prevalencia del target sube 26% según cómo se traten las devoluciones. Por eso el plan de mejora se aplica completo antes de construir el dataset de entrenamiento, y los agregados sin corregir no deben usarse como validación de que los datos están bien.</w:t>
+        <w:t xml:space="preserve">Los problemas de calidad mueven poco los agregados (menos de 2% en venta, unidades y capital), pero sí los cortes que usa el modelo: por SKU (duplicados y costos faltantes), por categoría (Decoración) y por posición. La prevalencia del target sube 30% según cómo se traten las devoluciones. Por eso el plan de mejora se aplica completo antes de construir el dataset de entrenamiento, y los agregados sin corregir no deben usarse como validación de que los datos están bien.</w:t>
       </w:r>
     </w:p>
     <w:p>
@@ -10494,7 +10494,7 @@
           <w:sz w:val="21"/>
           <w:szCs w:val="21"/>
         </w:rPr>
-        <w:t xml:space="preserve">El dataset se construye sobre los datos ya corregidos según el plan de la sección 1.2. La definición del target, la unidad y el horizonte surgen del relevamiento con el negocio y de la comparación de cinco variables objetivo candidatas; se eligió la que menos depende del estado actual de la posición (el 68% de sus positivos son casos nuevos, no arrastre).</w:t>
+        <w:t xml:space="preserve">El dataset se construye sobre los datos ya corregidos según el plan de la sección 1.2. La definición del target, la unidad y el horizonte surgen del relevamiento con el negocio y de la comparación de cinco variables objetivo candidatas. Con el universo definitivo (posiciones con al menos 3 meses de historia) las cinco tienen una inercia parecida: una regla que repite el estado actual acierta entre el 34% y el 39% de los casos en todas. La elección se apoya entonces en el negocio: un umbral relativo a la rotación de cada SKU, como pidió Comercial; sin discontinuados, que en 2026 no existen; y un evento sobre el que se puede actuar.</w:t>
       </w:r>
     </w:p>
     <w:tbl>
@@ -10623,21 +10623,21 @@
                 <w:sz w:val="15"/>
                 <w:szCs w:val="15"/>
               </w:rPr>
-              <w:t xml:space="preserve">Binaria. Vale 1 si la posición SKU–tienda tiene cobertura mayor a 12 meses dentro de 3 meses (t+3). Cobertura = stock disponible / promedio mensual de unidades vendidas de los últimos 12 meses, con las devoluciones neteadas. Se excluyen los SKUs discontinuados, que van a una lista aparte con regla fija.</w:t>
-            </w:r>
-          </w:p>
-          <w:p>
-            <w:pPr>
-              <w:spacing w:line="240"/>
-              <w:jc w:val="left"/>
-            </w:pPr>
-            <w:r>
-              <w:rPr>
-                <w:color w:val="000000"/>
-                <w:sz w:val="15"/>
-                <w:szCs w:val="15"/>
-              </w:rPr>
-              <w:t xml:space="preserve">Positivos: 4.428 de 131.189 filas (3,38%). Se prioriza recall: el negocio declaró más costoso el falso negativo.</w:t>
+              <w:t xml:space="preserve">Binaria. Vale 1 si la posición SKU–tienda tiene cobertura mayor a 12 meses dentro de 3 meses (t+3). Cobertura = stock disponible / promedio mensual de unidades vendidas de los últimos 12 meses (o de los disponibles, si la posición es más nueva), con las devoluciones neteadas. Se excluyen los SKUs discontinuados, que van a una lista aparte con regla fija.</w:t>
+            </w:r>
+          </w:p>
+          <w:p>
+            <w:pPr>
+              <w:spacing w:line="240"/>
+              <w:jc w:val="left"/>
+            </w:pPr>
+            <w:r>
+              <w:rPr>
+                <w:color w:val="000000"/>
+                <w:sz w:val="15"/>
+                <w:szCs w:val="15"/>
+              </w:rPr>
+              <w:t xml:space="preserve">Positivos: 6.853 de 201.306 filas (3,40%). Se prioriza recall: el negocio declaró más costoso el falso negativo.</w:t>
             </w:r>
           </w:p>
           <w:p>
@@ -10721,7 +10721,7 @@
                 <w:sz w:val="15"/>
                 <w:szCs w:val="15"/>
               </w:rPr>
-              <w:t xml:space="preserve">Universo: posiciones con stock disponible &gt; 0 en t, no discontinuadas, con al menos 12 meses de historia y con la posición observada en t+3.</w:t>
+              <w:t xml:space="preserve">Universo: posiciones con stock disponible &gt; 0 en t, no discontinuadas, con al menos 3 meses de historia y con la posición observada en t+3. Se bajó de 12 a 3 meses porque con 12 quedaban afuera el 40% de las filas, el 45% de los positivos y todos los productos nuevos, que son los de mayor riesgo (6,8% de positivos en sus primeros 3 meses contra 3,4% de las posiciones maduras). Una variable marca las posiciones con menos de 12 meses. Las de menos de 3 meses quedan fuera del modelo y requieren una regla aparte.</w:t>
             </w:r>
           </w:p>
         </w:tc>
@@ -10775,35 +10775,35 @@
                 <w:sz w:val="15"/>
                 <w:szCs w:val="15"/>
               </w:rPr>
-              <w:t xml:space="preserve">67 features (62 numéricas y 5 categóricas), todas calculadas con información disponible al cierre del mes t. Se incluyen todas las candidatas con fundamento de negocio; la selección final se hace en el modelado:</w:t>
-            </w:r>
-          </w:p>
-          <w:p>
-            <w:pPr>
-              <w:spacing w:line="240"/>
-              <w:jc w:val="left"/>
-            </w:pPr>
-            <w:r>
-              <w:rPr>
-                <w:color w:val="000000"/>
-                <w:sz w:val="15"/>
-                <w:szCs w:val="15"/>
-              </w:rPr>
-              <w:t xml:space="preserve">• Demanda de la posición (16): unidades del mes, de t-1 y t-2, de 3 y 6 meses, promedio y máximo de 12 meses, coeficiente de variación, tendencia 3 vs 12 meses, meses con venta, meses consecutivos sin venta, indicador sin venta en 12 meses, venta de 3 meses, precio medio realizado, descuento implícito, antigüedad de la posición.</w:t>
-            </w:r>
-          </w:p>
-          <w:p>
-            <w:pPr>
-              <w:spacing w:line="240"/>
-              <w:jc w:val="left"/>
-            </w:pPr>
-            <w:r>
-              <w:rPr>
-                <w:color w:val="000000"/>
-                <w:sz w:val="15"/>
-                <w:szCs w:val="15"/>
-              </w:rPr>
-              <w:t xml:space="preserve">• Stock de la posición (8): stock disponible, en tránsito y su proporción sobre el disponible, variación a 3 meses, cobertura actual y de hace 3 meses, cambio de cobertura, capital inmovilizado.</w:t>
+              <w:t xml:space="preserve">60 features (55 numéricas y 5 categóricas), todas calculadas con información disponible al cierre del mes t:</w:t>
+            </w:r>
+          </w:p>
+          <w:p>
+            <w:pPr>
+              <w:spacing w:line="240"/>
+              <w:jc w:val="left"/>
+            </w:pPr>
+            <w:r>
+              <w:rPr>
+                <w:color w:val="000000"/>
+                <w:sz w:val="15"/>
+                <w:szCs w:val="15"/>
+              </w:rPr>
+              <w:t xml:space="preserve">• Demanda e historia de la posición (14): unidades del mes, de t-1 y t-2, de 3 y 6 meses, promedio y máximo de 12 meses, coeficiente de variación, tendencia 3 vs 12 meses, meses con venta, meses consecutivos sin venta, indicador sin venta en 12 meses, antigüedad de la posición e indicador de historia corta.</w:t>
+            </w:r>
+          </w:p>
+          <w:p>
+            <w:pPr>
+              <w:spacing w:line="240"/>
+              <w:jc w:val="left"/>
+            </w:pPr>
+            <w:r>
+              <w:rPr>
+                <w:color w:val="000000"/>
+                <w:sz w:val="15"/>
+                <w:szCs w:val="15"/>
+              </w:rPr>
+              <w:t xml:space="preserve">• Stock de la posición (5): stock disponible, variación a 3 meses, cobertura actual y de hace 3 meses, cambio de cobertura.</w:t>
             </w:r>
           </w:p>
           <w:p>
@@ -10845,7 +10845,7 @@
                 <w:sz w:val="15"/>
                 <w:szCs w:val="15"/>
               </w:rPr>
-              <w:t xml:space="preserve">• Abastecimiento (9): OC recibidas en 3 y 12 meses, cantidad de OC, meses desde la última OC, OC pendientes, transferencias recibidas en 3 y 12 meses y enviadas, lead time y pedido mínimo.</w:t>
+              <w:t xml:space="preserve">• Abastecimiento (10): OC recibidas en 3 y 12 meses, cantidad de OC, meses desde la última OC, OC pendientes, transferencias recibidas en 3 y 12 meses y enviadas, lead time y pedido mínimo.</w:t>
             </w:r>
           </w:p>
           <w:p>
@@ -10873,7 +10873,7 @@
                 <w:sz w:val="15"/>
                 <w:szCs w:val="15"/>
               </w:rPr>
-              <w:t xml:space="preserve">• Producto (4 + 3 categóricas): precio de lista, precio relativo a la subcategoría, margen, antigüedad del SKU; categoría, subcategoría y proveedor.</w:t>
+              <w:t xml:space="preserve">• Producto (2 + 3 categóricas): precio relativo a la subcategoría, antigüedad del SKU; categoría, subcategoría y proveedor.</w:t>
             </w:r>
           </w:p>
           <w:p>
@@ -11095,7 +11095,7 @@
                 <w:sz w:val="15"/>
                 <w:szCs w:val="15"/>
               </w:rPr>
-              <w:t xml:space="preserve">Cortes t de dic-2022 a may-2026 (42 meses), con etiquetas hasta ago-2026. Las ventanas de 12 meses usan historia desde ene-2022.</w:t>
+              <w:t xml:space="preserve">Cortes t de mar-2022 a may-2026, con etiquetas hasta ago-2026. Las ventanas usan la historia disponible desde ene-2022.</w:t>
             </w:r>
           </w:p>
         </w:tc>
@@ -11165,63 +11165,63 @@
                 <w:sz w:val="15"/>
                 <w:szCs w:val="15"/>
               </w:rPr>
-              <w:t xml:space="preserve">• Train: t de dic-2022 a dic-2024 · 48.631 filas · 1,78% positivos.</w:t>
-            </w:r>
-          </w:p>
-          <w:p>
-            <w:pPr>
-              <w:spacing w:line="240"/>
-              <w:jc w:val="left"/>
-            </w:pPr>
-            <w:r>
-              <w:rPr>
-                <w:color w:val="000000"/>
-                <w:sz w:val="15"/>
-                <w:szCs w:val="15"/>
-              </w:rPr>
-              <w:t xml:space="preserve">• Validación: t de abr-2025 a sep-2025 · 28.895 filas · 1,94% positivos.</w:t>
-            </w:r>
-          </w:p>
-          <w:p>
-            <w:pPr>
-              <w:spacing w:line="240"/>
-              <w:jc w:val="left"/>
-            </w:pPr>
-            <w:r>
-              <w:rPr>
-                <w:color w:val="000000"/>
-                <w:sz w:val="15"/>
-                <w:szCs w:val="15"/>
-              </w:rPr>
-              <w:t xml:space="preserve">• Test: t de ene-2026 a may-2026 · 25.888 filas · 9,03% positivos.</w:t>
-            </w:r>
-          </w:p>
-          <w:p>
-            <w:pPr>
-              <w:spacing w:line="240"/>
-              <w:jc w:val="left"/>
-            </w:pPr>
-            <w:r>
-              <w:rPr>
-                <w:color w:val="000000"/>
-                <w:sz w:val="15"/>
-                <w:szCs w:val="15"/>
-              </w:rPr>
-              <w:t xml:space="preserve">• Embargo (no se evalúa): ene-mar 2025 y oct-dic 2025 · 27.775 filas. El modelo final se reentrena con todas las filas.</w:t>
-            </w:r>
-          </w:p>
-          <w:p>
-            <w:pPr>
-              <w:spacing w:line="240"/>
-              <w:jc w:val="left"/>
-            </w:pPr>
-            <w:r>
-              <w:rPr>
-                <w:color w:val="000000"/>
-                <w:sz w:val="15"/>
-                <w:szCs w:val="15"/>
-              </w:rPr>
-              <w:t xml:space="preserve">La prevalencia de 2026 es 4,6 veces la de 2023-2025 (la venta cae 13,2%): el test mide si el modelo resiste ese cambio de régimen.</w:t>
+              <w:t xml:space="preserve">• Train: t de mar-2022 a dic-2024 · 98.649 filas · 2,50% positivos.</w:t>
+            </w:r>
+          </w:p>
+          <w:p>
+            <w:pPr>
+              <w:spacing w:line="240"/>
+              <w:jc w:val="left"/>
+            </w:pPr>
+            <w:r>
+              <w:rPr>
+                <w:color w:val="000000"/>
+                <w:sz w:val="15"/>
+                <w:szCs w:val="15"/>
+              </w:rPr>
+              <w:t xml:space="preserve">• Validación: t de abr-2025 a sep-2025 · 38.362 filas · 2,23% positivos.</w:t>
+            </w:r>
+          </w:p>
+          <w:p>
+            <w:pPr>
+              <w:spacing w:line="240"/>
+              <w:jc w:val="left"/>
+            </w:pPr>
+            <w:r>
+              <w:rPr>
+                <w:color w:val="000000"/>
+                <w:sz w:val="15"/>
+                <w:szCs w:val="15"/>
+              </w:rPr>
+              <w:t xml:space="preserve">• Test: t de ene-2026 a may-2026 · 28.070 filas · 9,03% positivos.</w:t>
+            </w:r>
+          </w:p>
+          <w:p>
+            <w:pPr>
+              <w:spacing w:line="240"/>
+              <w:jc w:val="left"/>
+            </w:pPr>
+            <w:r>
+              <w:rPr>
+                <w:color w:val="000000"/>
+                <w:sz w:val="15"/>
+                <w:szCs w:val="15"/>
+              </w:rPr>
+              <w:t xml:space="preserve">• Embargo (no se evalúa): ene-mar 2025 y oct-dic 2025 · 36.225 filas. El modelo final se reentrena con todas las filas.</w:t>
+            </w:r>
+          </w:p>
+          <w:p>
+            <w:pPr>
+              <w:spacing w:line="240"/>
+              <w:jc w:val="left"/>
+            </w:pPr>
+            <w:r>
+              <w:rPr>
+                <w:color w:val="000000"/>
+                <w:sz w:val="15"/>
+                <w:szCs w:val="15"/>
+              </w:rPr>
+              <w:t xml:space="preserve">La prevalencia de 2026 (9,0%) es más del triple que la de 2022-2025 (2,5%; la venta cae 13,2%): el test mide si el modelo resiste ese cambio de régimen.</w:t>
             </w:r>
           </w:p>
         </w:tc>
@@ -11275,7 +11275,7 @@
                 <w:sz w:val="15"/>
                 <w:szCs w:val="15"/>
               </w:rPr>
-              <w:t xml:space="preserve">dataset_entrenamiento_v2 (Datasets_Modelo/dataset_entrenamiento_v2.parquet). Versión transformada: dataset_entrenamiento_v2_transformado.parquet. Diccionario: diccionario_features_v2.csv. Generado por Modelo/construir_dataset_modelo.py, reproducible desde Datasets_Normalizados. La v2 reemplaza a una v1 interna de 39 features que no llegó a publicarse.</w:t>
+              <w:t xml:space="preserve">dataset_entrenamiento_v3 (Datasets_Modelo/dataset_entrenamiento_v3.parquet). Versión transformada: dataset_entrenamiento_v3_transformado.parquet. Diccionario: diccionario_features_v3.csv. Generado por Modelo/construir_dataset_modelo.py, reproducible desde Datasets_Normalizados. La v3 reemplaza a versiones internas anteriores: amplía el universo a posiciones con 3 meses de historia y saca las variables de precio y costo absolutos y de stock en tránsito.</w:t>
             </w:r>
           </w:p>
         </w:tc>
@@ -11331,7 +11331,7 @@
                 <w:sz w:val="15"/>
                 <w:szCs w:val="15"/>
               </w:rPr>
-              <w:t xml:space="preserve">131.189 filas × 67 features, más 3 identificadores (mes, tienda, SKU), el target, la partición y una marca de costo imputado. Cubre 8.587 posiciones, 682 SKUs y 28 tiendas. Después de la codificación one-hot: 113 columnas de features.</w:t>
+              <w:t xml:space="preserve">201.306 filas × 60 features, más 3 identificadores (mes, tienda, SKU), el target, la partición y una marca de costo imputado. Cubre 9.818 posiciones, 750 SKUs y 28 tiendas. Después de la codificación one-hot: 106 columnas de features.</w:t>
             </w:r>
           </w:p>
         </w:tc>
@@ -11702,7 +11702,7 @@
                 <w:sz w:val="15"/>
                 <w:szCs w:val="15"/>
               </w:rPr>
-              <w:t xml:space="preserve">Base del target (stock disponible). Corregida por H1 y H4. El stock en tránsito se usa con cautela (H6).</w:t>
+              <w:t xml:space="preserve">Base del target (stock disponible). Corregida por H1 y H4. El stock en tránsito no se usa: no tiene definición y pierde la señal en 2026 (H6).</w:t>
             </w:r>
           </w:p>
         </w:tc>
@@ -11804,7 +11804,7 @@
                 <w:sz w:val="15"/>
                 <w:szCs w:val="15"/>
               </w:rPr>
-              <w:t xml:space="preserve">Categoría, precio, costo y estado. Define los discontinuados que salen del universo. Congelado desde jun-2025 (H12).</w:t>
+              <w:t xml:space="preserve">Categoría, subcategoría, proveedor, antigüedad y precio relativo; define los discontinuados. Precio, costo y margen absolutos no se usan: son el valor actual (P10).</w:t>
             </w:r>
           </w:p>
         </w:tc>
@@ -13778,6 +13778,162 @@
         <w:tc>
           <w:tcPr>
             <w:tcW w:type="dxa" w:w="2600"/>
+            <w:tcMar>
+              <w:top w:type="dxa" w:w="50"/>
+              <w:left w:type="dxa" w:w="80"/>
+              <w:bottom w:type="dxa" w:w="50"/>
+              <w:right w:type="dxa" w:w="80"/>
+            </w:tcMar>
+          </w:tcPr>
+          <w:p>
+            <w:pPr>
+              <w:spacing w:line="240"/>
+              <w:jc w:val="left"/>
+            </w:pPr>
+            <w:r>
+              <w:rPr>
+                <w:color w:val="000000"/>
+                <w:sz w:val="15"/>
+                <w:szCs w:val="15"/>
+              </w:rPr>
+              <w:t xml:space="preserve">Precio, costo y margen del catálogo (y capital, venta en pesos y descuento implícito derivados)</w:t>
+            </w:r>
+          </w:p>
+        </w:tc>
+        <w:tc>
+          <w:tcPr>
+            <w:tcW w:type="dxa" w:w="1000"/>
+            <w:tcMar>
+              <w:top w:type="dxa" w:w="50"/>
+              <w:left w:type="dxa" w:w="80"/>
+              <w:bottom w:type="dxa" w:w="50"/>
+              <w:right w:type="dxa" w:w="80"/>
+            </w:tcMar>
+          </w:tcPr>
+          <w:p>
+            <w:pPr>
+              <w:spacing w:line="240"/>
+              <w:jc w:val="left"/>
+            </w:pPr>
+            <w:r>
+              <w:rPr>
+                <w:color w:val="000000"/>
+                <w:sz w:val="15"/>
+                <w:szCs w:val="15"/>
+              </w:rPr>
+              <w:t xml:space="preserve">Calidad</w:t>
+            </w:r>
+          </w:p>
+        </w:tc>
+        <w:tc>
+          <w:tcPr>
+            <w:tcW w:type="dxa" w:w="5400"/>
+            <w:gridSpan w:val="2"/>
+            <w:tcMar>
+              <w:top w:type="dxa" w:w="50"/>
+              <w:left w:type="dxa" w:w="80"/>
+              <w:bottom w:type="dxa" w:w="50"/>
+              <w:right w:type="dxa" w:w="80"/>
+            </w:tcMar>
+          </w:tcPr>
+          <w:p>
+            <w:pPr>
+              <w:spacing w:line="240"/>
+              <w:jc w:val="left"/>
+            </w:pPr>
+            <w:r>
+              <w:rPr>
+                <w:color w:val="000000"/>
+                <w:sz w:val="15"/>
+                <w:szCs w:val="15"/>
+              </w:rPr>
+              <w:t xml:space="preserve">El catálogo guarda solo el valor actual (el sistema pisa el anterior, P10): aplicado a meses pasados es anacrónico, igual que el estado del catálogo. Se conserva solo el precio relativo a la subcategoría, que cambia poco con los ajustes de precio.</w:t>
+            </w:r>
+          </w:p>
+        </w:tc>
+      </w:tr>
+      <w:tr>
+        <w:tc>
+          <w:tcPr>
+            <w:tcW w:type="dxa" w:w="2600"/>
+            <w:tcMar>
+              <w:top w:type="dxa" w:w="50"/>
+              <w:left w:type="dxa" w:w="80"/>
+              <w:bottom w:type="dxa" w:w="50"/>
+              <w:right w:type="dxa" w:w="80"/>
+            </w:tcMar>
+          </w:tcPr>
+          <w:p>
+            <w:pPr>
+              <w:spacing w:line="240"/>
+              <w:jc w:val="left"/>
+            </w:pPr>
+            <w:r>
+              <w:rPr>
+                <w:color w:val="000000"/>
+                <w:sz w:val="15"/>
+                <w:szCs w:val="15"/>
+              </w:rPr>
+              <w:t xml:space="preserve">Stock en tránsito</w:t>
+            </w:r>
+          </w:p>
+        </w:tc>
+        <w:tc>
+          <w:tcPr>
+            <w:tcW w:type="dxa" w:w="1000"/>
+            <w:tcMar>
+              <w:top w:type="dxa" w:w="50"/>
+              <w:left w:type="dxa" w:w="80"/>
+              <w:bottom w:type="dxa" w:w="50"/>
+              <w:right w:type="dxa" w:w="80"/>
+            </w:tcMar>
+          </w:tcPr>
+          <w:p>
+            <w:pPr>
+              <w:spacing w:line="240"/>
+              <w:jc w:val="left"/>
+            </w:pPr>
+            <w:r>
+              <w:rPr>
+                <w:color w:val="000000"/>
+                <w:sz w:val="15"/>
+                <w:szCs w:val="15"/>
+              </w:rPr>
+              <w:t xml:space="preserve">Calidad</w:t>
+            </w:r>
+          </w:p>
+        </w:tc>
+        <w:tc>
+          <w:tcPr>
+            <w:tcW w:type="dxa" w:w="5400"/>
+            <w:gridSpan w:val="2"/>
+            <w:tcMar>
+              <w:top w:type="dxa" w:w="50"/>
+              <w:left w:type="dxa" w:w="80"/>
+              <w:bottom w:type="dxa" w:w="50"/>
+              <w:right w:type="dxa" w:w="80"/>
+            </w:tcMar>
+          </w:tcPr>
+          <w:p>
+            <w:pPr>
+              <w:spacing w:line="240"/>
+              <w:jc w:val="left"/>
+            </w:pPr>
+            <w:r>
+              <w:rPr>
+                <w:color w:val="000000"/>
+                <w:sz w:val="15"/>
+                <w:szCs w:val="15"/>
+              </w:rPr>
+              <w:t xml:space="preserve">Campo sin definición documentada (H6); su señal pasa de AUC 0,67 en train a 0,50 en 2026.</w:t>
+            </w:r>
+          </w:p>
+        </w:tc>
+      </w:tr>
+      <w:tr>
+        <w:tc>
+          <w:tcPr>
+            <w:tcW w:type="dxa" w:w="2600"/>
             <w:shd w:fill="F2F2F2" w:color="auto" w:val="clear"/>
             <w:tcMar>
               <w:top w:type="dxa" w:w="50"/>
@@ -14465,7 +14621,7 @@
                 <w:sz w:val="15"/>
                 <w:szCs w:val="15"/>
               </w:rPr>
-              <w:t xml:space="preserve">Variables continuas de demanda, stock, precio, abastecimiento y contexto (45)</w:t>
+              <w:t xml:space="preserve">Variables continuas de demanda, stock, abastecimiento y contexto (37)</w:t>
             </w:r>
           </w:p>
         </w:tc>
@@ -14571,7 +14727,7 @@
                 <w:sz w:val="15"/>
                 <w:szCs w:val="15"/>
               </w:rPr>
-              <w:t xml:space="preserve">25 variables con asimetría &gt; 1 en train: stock, cobertura, capital inmovilizado, OC, transferencias, liquidaciones, promociones, meses sin venta, coeficiente de variación, entre otras</w:t>
+              <w:t xml:space="preserve">24 variables con asimetría &gt; 1 en train: stock, cobertura, OC, transferencias, liquidaciones, promociones, meses sin venta, coeficiente de variación, entre otras</w:t>
             </w:r>
           </w:p>
         </w:tc>
@@ -14995,7 +15151,7 @@
                 <w:sz w:val="15"/>
                 <w:szCs w:val="15"/>
               </w:rPr>
-              <w:t xml:space="preserve">Ratios sin denominador (177 filas sin venta en 12 meses), cobertura de hace 3 meses, meses desde la última OC (17.295 filas sin OC previa), cumplimiento presupuestario sin presupuesto válido, eventos inexistentes.</w:t>
+              <w:t xml:space="preserve">Ratios sin denominador (posiciones sin venta), variación y cobertura de hace 3 meses en posiciones con menos de 4 meses (8.176 filas), meses desde la última OC (50.103 filas sin OC previa), cumplimiento presupuestario sin presupuesto válido, eventos inexistentes.</w:t>
             </w:r>
           </w:p>
         </w:tc>
@@ -15021,7 +15177,7 @@
                 <w:sz w:val="15"/>
                 <w:szCs w:val="15"/>
               </w:rPr>
-              <w:t xml:space="preserve">Coberturas con tope de 60 meses más el indicador sin venta; meses desde la última OC con tope de 60; tendencias en 1 (neutro) y proporciones en 0; cumplimiento y cobertura de depósito con la mediana de train; eventos ausentes en 0.</w:t>
+              <w:t xml:space="preserve">Coberturas con tope de 60 meses más el indicador sin venta; cobertura de hace 3 meses igual a la actual cuando no hay dato (sin cambio); meses desde la última OC con tope de 60; tendencias en 1 (neutro) y proporciones en 0; cumplimiento y cobertura de depósito con la mediana de train; eventos ausentes en 0.</w:t>
             </w:r>
           </w:p>
         </w:tc>
@@ -15126,7 +15282,7 @@
                 <w:sz w:val="15"/>
                 <w:szCs w:val="15"/>
               </w:rPr>
-              <w:t xml:space="preserve">Sin sobremuestreo. Ponderación de clases (peso de la clase positiva ≈ 55, calculado en train) y umbral de decisión elegido en validación para priorizar recall.</w:t>
+              <w:t xml:space="preserve">Sin sobremuestreo. Ponderación de clases (peso de la clase positiva ≈ 39, calculado en train) y umbral de decisión elegido en validación para priorizar recall.</w:t>
             </w:r>
           </w:p>
         </w:tc>
@@ -15151,7 +15307,7 @@
                 <w:sz w:val="15"/>
                 <w:szCs w:val="15"/>
               </w:rPr>
-              <w:t xml:space="preserve">La prevalencia en train es 1,8%. SMOTE crearía posiciones sintéticas que mezclan meses y rompería la estructura temporal. El negocio prioriza recall.</w:t>
+              <w:t xml:space="preserve">La prevalencia en train es 2,5%. SMOTE crearía posiciones sintéticas que mezclan meses y rompería la estructura temporal. El negocio prioriza recall.</w:t>
             </w:r>
           </w:p>
         </w:tc>

</xml_diff>